<commit_message>
Finished Master questions 1-9
</commit_message>
<xml_diff>
--- a/DM2026-Lab1-Master-Questions.docx
+++ b/DM2026-Lab1-Master-Questions.docx
@@ -99,7 +99,7 @@
         </w:rPr>
       </w:r>
       <w:r>
-        <w:pict w14:anchorId="0DCD834A">
+        <w:pict w14:anchorId="49188BD7">
           <v:rect id="Horizontal Line 1" o:spid="_x0000_s2062" style="width:451.3pt;height:1.1pt;visibility:visible;mso-wrap-style:square;mso-left-percent:-10001;mso-top-percent:-10001;mso-position-horizontal:absolute;mso-position-horizontal-relative:char;mso-position-vertical:absolute;mso-position-vertical-relative:line;mso-left-percent:-10001;mso-top-percent:-10001;v-text-anchor:top" o:gfxdata="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" filled="f">
             <o:lock v:ext="edit" rotation="t" aspectratio="t" verticies="t" text="t" shapetype="t"/>
             <w10:anchorlock/>
@@ -361,7 +361,7 @@
         </w:rPr>
       </w:r>
       <w:r>
-        <w:pict w14:anchorId="2274DB1F">
+        <w:pict w14:anchorId="42DDFFA5">
           <v:rect id="Horizontal Line 2" o:spid="_x0000_s2061" style="width:451.3pt;height:1.1pt;visibility:visible;mso-wrap-style:square;mso-left-percent:-10001;mso-top-percent:-10001;mso-position-horizontal:absolute;mso-position-horizontal-relative:char;mso-position-vertical:absolute;mso-position-vertical-relative:line;mso-left-percent:-10001;mso-top-percent:-10001;v-text-anchor:top" o:gfxdata="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" filled="f">
             <o:lock v:ext="edit" rotation="t" aspectratio="t" verticies="t" text="t" shapetype="t"/>
             <w10:anchorlock/>
@@ -1330,7 +1330,7 @@
         </w:rPr>
       </w:r>
       <w:r>
-        <w:pict w14:anchorId="6A86D585">
+        <w:pict w14:anchorId="5FECD586">
           <v:rect id="Horizontal Line 3" o:spid="_x0000_s2060" style="width:451.3pt;height:1.1pt;visibility:visible;mso-wrap-style:square;mso-left-percent:-10001;mso-top-percent:-10001;mso-position-horizontal:absolute;mso-position-horizontal-relative:char;mso-position-vertical:absolute;mso-position-vertical-relative:line;mso-left-percent:-10001;mso-top-percent:-10001;v-text-anchor:top" o:gfxdata="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" filled="f">
             <o:lock v:ext="edit" rotation="t" aspectratio="t" verticies="t" text="t" shapetype="t"/>
             <w10:anchorlock/>
@@ -1666,7 +1666,7 @@
         </w:rPr>
       </w:r>
       <w:r>
-        <w:pict w14:anchorId="1250037C">
+        <w:pict w14:anchorId="6F32A785">
           <v:rect id="Horizontal Line 4" o:spid="_x0000_s2059" style="width:451.3pt;height:1.1pt;visibility:visible;mso-wrap-style:square;mso-left-percent:-10001;mso-top-percent:-10001;mso-position-horizontal:absolute;mso-position-horizontal-relative:char;mso-position-vertical:absolute;mso-position-vertical-relative:line;mso-left-percent:-10001;mso-top-percent:-10001;v-text-anchor:top" o:gfxdata="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" filled="f">
             <o:lock v:ext="edit" rotation="t" aspectratio="t" verticies="t" text="t" shapetype="t"/>
             <w10:anchorlock/>
@@ -2049,7 +2049,7 @@
         </w:rPr>
       </w:r>
       <w:r>
-        <w:pict w14:anchorId="14E20F77">
+        <w:pict w14:anchorId="69006115">
           <v:rect id="Horizontal Line 5" o:spid="_x0000_s2058" style="width:451.3pt;height:1.1pt;visibility:visible;mso-wrap-style:square;mso-left-percent:-10001;mso-top-percent:-10001;mso-position-horizontal:absolute;mso-position-horizontal-relative:char;mso-position-vertical:absolute;mso-position-vertical-relative:line;mso-left-percent:-10001;mso-top-percent:-10001;v-text-anchor:top" o:gfxdata="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" filled="f">
             <o:lock v:ext="edit" rotation="t" aspectratio="t" verticies="t" text="t" shapetype="t"/>
             <w10:anchorlock/>
@@ -2441,7 +2441,7 @@
         </w:rPr>
       </w:r>
       <w:r>
-        <w:pict w14:anchorId="666B7120">
+        <w:pict w14:anchorId="6C9783F2">
           <v:rect id="Horizontal Line 6" o:spid="_x0000_s2057" style="width:451.3pt;height:1.1pt;visibility:visible;mso-wrap-style:square;mso-left-percent:-10001;mso-top-percent:-10001;mso-position-horizontal:absolute;mso-position-horizontal-relative:char;mso-position-vertical:absolute;mso-position-vertical-relative:line;mso-left-percent:-10001;mso-top-percent:-10001;v-text-anchor:top" o:gfxdata="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" filled="f">
             <o:lock v:ext="edit" rotation="t" aspectratio="t" verticies="t" text="t" shapetype="t"/>
             <w10:anchorlock/>
@@ -2927,7 +2927,7 @@
         </w:rPr>
       </w:r>
       <w:r>
-        <w:pict w14:anchorId="4746A304">
+        <w:pict w14:anchorId="5C31F8B2">
           <v:rect id="Horizontal Line 7" o:spid="_x0000_s2056" style="width:451.3pt;height:1.1pt;visibility:visible;mso-wrap-style:square;mso-left-percent:-10001;mso-top-percent:-10001;mso-position-horizontal:absolute;mso-position-horizontal-relative:char;mso-position-vertical:absolute;mso-position-vertical-relative:line;mso-left-percent:-10001;mso-top-percent:-10001;v-text-anchor:top" o:gfxdata="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" filled="f">
             <o:lock v:ext="edit" rotation="t" aspectratio="t" verticies="t" text="t" shapetype="t"/>
             <w10:anchorlock/>
@@ -3704,7 +3704,7 @@
         </w:rPr>
       </w:r>
       <w:r>
-        <w:pict w14:anchorId="616661EA">
+        <w:pict w14:anchorId="3C833291">
           <v:rect id="Horizontal Line 8" o:spid="_x0000_s2055" style="width:451.3pt;height:1.1pt;visibility:visible;mso-wrap-style:square;mso-left-percent:-10001;mso-top-percent:-10001;mso-position-horizontal:absolute;mso-position-horizontal-relative:char;mso-position-vertical:absolute;mso-position-vertical-relative:line;mso-left-percent:-10001;mso-top-percent:-10001;v-text-anchor:top" o:gfxdata="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" filled="f">
             <o:lock v:ext="edit" rotation="t" aspectratio="t" verticies="t" text="t" shapetype="t"/>
             <w10:anchorlock/>
@@ -4203,7 +4203,7 @@
         </w:rPr>
       </w:r>
       <w:r>
-        <w:pict w14:anchorId="11E8602F">
+        <w:pict w14:anchorId="795BCB8E">
           <v:rect id="Horizontal Line 9" o:spid="_x0000_s2054" style="width:451.3pt;height:1.1pt;visibility:visible;mso-wrap-style:square;mso-left-percent:-10001;mso-top-percent:-10001;mso-position-horizontal:absolute;mso-position-horizontal-relative:char;mso-position-vertical:absolute;mso-position-vertical-relative:line;mso-left-percent:-10001;mso-top-percent:-10001;v-text-anchor:top" o:gfxdata="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" filled="f">
             <o:lock v:ext="edit" rotation="t" aspectratio="t" verticies="t" text="t" shapetype="t"/>
             <w10:anchorlock/>
@@ -4494,6 +4494,8 @@
         <w:jc w:val="both"/>
         <w:rPr>
           <w:rFonts w:ascii="Century Schoolbook" w:hAnsi="Century Schoolbook"/>
+          <w:b/>
+          <w:bCs/>
         </w:rPr>
       </w:pPr>
       <w:r>
@@ -4515,6 +4517,28 @@
       <w:r>
         <w:rPr>
           <w:rFonts w:ascii="Century Schoolbook" w:hAnsi="Century Schoolbook"/>
+        </w:rPr>
+        <w:t>Decreasing minSup from 9 to 3 makes the execution runtime much slower and the total number of discovered patterns increases significantly</w:t>
+      </w:r>
+      <w:r>
+        <w:rPr>
+          <w:rFonts w:ascii="Century Schoolbook" w:hAnsi="Century Schoolbook"/>
+        </w:rPr>
+        <w:t>.</w:t>
+      </w:r>
+    </w:p>
+    <w:p>
+      <w:pPr>
+        <w:jc w:val="both"/>
+        <w:rPr>
+          <w:rFonts w:ascii="Century Schoolbook" w:hAnsi="Century Schoolbook"/>
+          <w:b/>
+          <w:bCs/>
+        </w:rPr>
+      </w:pPr>
+      <w:r>
+        <w:rPr>
+          <w:rFonts w:ascii="Century Schoolbook" w:hAnsi="Century Schoolbook"/>
           <w:b/>
           <w:bCs/>
         </w:rPr>
@@ -4531,6 +4555,70 @@
       <w:r>
         <w:rPr>
           <w:rFonts w:ascii="Century Schoolbook" w:hAnsi="Century Schoolbook"/>
+        </w:rPr>
+        <w:t>When minSup = 9, every pattern that appears in at least 9 document</w:t>
+      </w:r>
+      <w:r>
+        <w:rPr>
+          <w:rFonts w:ascii="Century Schoolbook" w:hAnsi="Century Schoolbook"/>
+        </w:rPr>
+        <w:t>s</w:t>
+      </w:r>
+      <w:r>
+        <w:rPr>
+          <w:rFonts w:ascii="Century Schoolbook" w:hAnsi="Century Schoolbook"/>
+        </w:rPr>
+        <w:t xml:space="preserve"> </w:t>
+      </w:r>
+      <w:r>
+        <w:rPr>
+          <w:rFonts w:ascii="Century Schoolbook" w:hAnsi="Century Schoolbook"/>
+        </w:rPr>
+        <w:t>are</w:t>
+      </w:r>
+      <w:r>
+        <w:rPr>
+          <w:rFonts w:ascii="Century Schoolbook" w:hAnsi="Century Schoolbook"/>
+        </w:rPr>
+        <w:t xml:space="preserve"> kept. When I lowered minSup to minSup = 3, the number of results increased by a lot, since the threshold was suddenly much lower. On the other hand, k is a count. When k = 100, FAE keeps the 100 most </w:t>
+      </w:r>
+      <w:r>
+        <w:rPr>
+          <w:rFonts w:ascii="Century Schoolbook" w:hAnsi="Century Schoolbook"/>
+        </w:rPr>
+        <w:t>frequent</w:t>
+      </w:r>
+      <w:r>
+        <w:rPr>
+          <w:rFonts w:ascii="Century Schoolbook" w:hAnsi="Century Schoolbook"/>
+        </w:rPr>
+        <w:t xml:space="preserve"> patterns. For k = 100 vs. k = 500, the lowest support value in </w:t>
+      </w:r>
+      <w:r>
+        <w:rPr>
+          <w:rFonts w:ascii="Century Schoolbook" w:hAnsi="Century Schoolbook"/>
+        </w:rPr>
+        <w:t>100 to 500 decreased from 21 to 16.</w:t>
+      </w:r>
+      <w:r>
+        <w:rPr>
+          <w:rFonts w:ascii="Century Schoolbook" w:hAnsi="Century Schoolbook"/>
+        </w:rPr>
+        <w:t xml:space="preserve"> </w:t>
+      </w:r>
+    </w:p>
+    <w:p>
+      <w:pPr>
+        <w:jc w:val="both"/>
+        <w:rPr>
+          <w:rFonts w:ascii="Century Schoolbook" w:hAnsi="Century Schoolbook"/>
+          <w:b/>
+          <w:bCs/>
+        </w:rPr>
+      </w:pPr>
+      <w:r>
+        <w:rPr>
+          <w:rFonts w:ascii="Century Schoolbook" w:hAnsi="Century Schoolbook"/>
           <w:b/>
           <w:bCs/>
         </w:rPr>
@@ -4547,6 +4635,56 @@
       <w:r>
         <w:rPr>
           <w:rFonts w:ascii="Century Schoolbook" w:hAnsi="Century Schoolbook"/>
+        </w:rPr>
+        <w:t>A frequent pattern is maximal if you can’t add any more words to it and still have it be frequent.</w:t>
+      </w:r>
+      <w:r>
+        <w:rPr>
+          <w:rFonts w:ascii="Century Schoolbook" w:hAnsi="Century Schoolbook"/>
+        </w:rPr>
+        <w:t xml:space="preserve"> </w:t>
+      </w:r>
+      <w:r>
+        <w:rPr>
+          <w:rFonts w:ascii="Century Schoolbook" w:hAnsi="Century Schoolbook"/>
+        </w:rPr>
+        <w:t xml:space="preserve">Maximal patterns are more concise because each </w:t>
+      </w:r>
+      <w:r>
+        <w:rPr>
+          <w:rFonts w:ascii="Century Schoolbook" w:hAnsi="Century Schoolbook"/>
+        </w:rPr>
+        <w:t>pattern</w:t>
+      </w:r>
+      <w:r>
+        <w:rPr>
+          <w:rFonts w:ascii="Century Schoolbook" w:hAnsi="Century Schoolbook"/>
+        </w:rPr>
+        <w:t xml:space="preserve"> stands in o</w:t>
+      </w:r>
+      <w:r>
+        <w:rPr>
+          <w:rFonts w:ascii="Century Schoolbook" w:hAnsi="Century Schoolbook"/>
+        </w:rPr>
+        <w:t>f</w:t>
+      </w:r>
+      <w:r>
+        <w:rPr>
+          <w:rFonts w:ascii="Century Schoolbook" w:hAnsi="Century Schoolbook"/>
+        </w:rPr>
+        <w:t xml:space="preserve"> all of its subsets. The smaller patterns that are similar to the larger ones are dropped, since their frequency is implied by the larger patterns. </w:t>
+      </w:r>
+    </w:p>
+    <w:p>
+      <w:pPr>
+        <w:jc w:val="both"/>
+        <w:rPr>
+          <w:rFonts w:ascii="Century Schoolbook" w:hAnsi="Century Schoolbook"/>
+        </w:rPr>
+      </w:pPr>
+      <w:r>
+        <w:rPr>
+          <w:rFonts w:ascii="Century Schoolbook" w:hAnsi="Century Schoolbook"/>
           <w:b/>
           <w:bCs/>
         </w:rPr>
@@ -4556,7 +4694,20 @@
         <w:rPr>
           <w:rFonts w:ascii="Century Schoolbook" w:hAnsi="Century Schoolbook"/>
         </w:rPr>
-        <w:t xml:space="preserve"> Yes / No </w:t>
+        <w:t xml:space="preserve"> </w:t>
+      </w:r>
+      <w:r>
+        <w:rPr>
+          <w:rFonts w:ascii="Century Schoolbook" w:hAnsi="Century Schoolbook"/>
+          <w:highlight w:val="yellow"/>
+        </w:rPr>
+        <w:t>Yes</w:t>
+      </w:r>
+      <w:r>
+        <w:rPr>
+          <w:rFonts w:ascii="Century Schoolbook" w:hAnsi="Century Schoolbook"/>
+        </w:rPr>
+        <w:t xml:space="preserve"> / No </w:t>
       </w:r>
     </w:p>
     <w:p>
@@ -4580,6 +4731,12 @@
         </w:rPr>
         <w:t xml:space="preserve"> </w:t>
       </w:r>
+      <w:r>
+        <w:rPr>
+          <w:rFonts w:ascii="Century Schoolbook" w:hAnsi="Century Schoolbook"/>
+        </w:rPr>
+        <w:t xml:space="preserve">Explaining concepts of what makes a frequent pattern “maximal”. </w:t>
+      </w:r>
     </w:p>
     <w:p>
       <w:pPr>
@@ -4616,7 +4773,7 @@
         </w:rPr>
       </w:r>
       <w:r>
-        <w:pict w14:anchorId="1A08230B">
+        <w:pict w14:anchorId="72FFD1B6">
           <v:rect id="Horizontal Line 10" o:spid="_x0000_s2053" style="width:451.3pt;height:1.1pt;visibility:visible;mso-wrap-style:square;mso-left-percent:-10001;mso-top-percent:-10001;mso-position-horizontal:absolute;mso-position-horizontal-relative:char;mso-position-vertical:absolute;mso-position-vertical-relative:line;mso-left-percent:-10001;mso-top-percent:-10001;v-text-anchor:top" o:gfxdata="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" filled="f">
             <o:lock v:ext="edit" rotation="t" aspectratio="t" verticies="t" text="t" shapetype="t"/>
             <w10:anchorlock/>
@@ -4767,6 +4924,7 @@
         <w:rPr>
           <w:rFonts w:ascii="Century Schoolbook" w:hAnsi="Century Schoolbook"/>
         </w:rPr>
+        <w:lastRenderedPageBreak/>
         <w:t>What specific category of data mining algorithms (referenced in the helper files) must be applied first?</w:t>
       </w:r>
     </w:p>
@@ -4775,6 +4933,8 @@
         <w:jc w:val="both"/>
         <w:rPr>
           <w:rFonts w:ascii="Century Schoolbook" w:hAnsi="Century Schoolbook"/>
+          <w:b/>
+          <w:bCs/>
         </w:rPr>
       </w:pPr>
       <w:r>
@@ -4788,6 +4948,44 @@
     </w:p>
     <w:p>
       <w:pPr>
+        <w:pStyle w:val="ListParagraph"/>
+        <w:numPr>
+          <w:ilvl w:val="2"/>
+          <w:numId w:val="7"/>
+        </w:numPr>
+        <w:jc w:val="both"/>
+        <w:rPr>
+          <w:rFonts w:ascii="Century Schoolbook" w:hAnsi="Century Schoolbook"/>
+        </w:rPr>
+      </w:pPr>
+      <w:r>
+        <w:rPr>
+          <w:rFonts w:ascii="Century Schoolbook" w:hAnsi="Century Schoolbook"/>
+        </w:rPr>
+        <w:t xml:space="preserve">It would be mathematically impossible to plot the raw X_counts matric directly because, in X_count, every word has its own one dimensional column. We found that it has around 35,000 colums, and to place one document would be a dot, and we would need a graph with around 35,000 axes to do this. Visually, people can only see 2-3 dimensions, so there wouldn’t be a way to draw these axes. </w:t>
+      </w:r>
+    </w:p>
+    <w:p>
+      <w:pPr>
+        <w:pStyle w:val="ListParagraph"/>
+        <w:numPr>
+          <w:ilvl w:val="2"/>
+          <w:numId w:val="7"/>
+        </w:numPr>
+        <w:jc w:val="both"/>
+        <w:rPr>
+          <w:rFonts w:ascii="Century Schoolbook" w:hAnsi="Century Schoolbook"/>
+        </w:rPr>
+      </w:pPr>
+      <w:r>
+        <w:rPr>
+          <w:rFonts w:ascii="Century Schoolbook" w:hAnsi="Century Schoolbook"/>
+        </w:rPr>
+        <w:t xml:space="preserve">Dimensionality reduction must be applied first. It takes data with many columns and builds a small number of new columns, usually 2 or 3, that capture most of the important information from these columns. </w:t>
+      </w:r>
+    </w:p>
+    <w:p>
+      <w:pPr>
         <w:jc w:val="both"/>
         <w:rPr>
           <w:rFonts w:ascii="Century Schoolbook" w:hAnsi="Century Schoolbook"/>
@@ -4805,7 +5003,20 @@
         <w:rPr>
           <w:rFonts w:ascii="Century Schoolbook" w:hAnsi="Century Schoolbook"/>
         </w:rPr>
-        <w:t xml:space="preserve"> Yes / No </w:t>
+        <w:t xml:space="preserve"> </w:t>
+      </w:r>
+      <w:r>
+        <w:rPr>
+          <w:rFonts w:ascii="Century Schoolbook" w:hAnsi="Century Schoolbook"/>
+          <w:highlight w:val="yellow"/>
+        </w:rPr>
+        <w:t>Yes</w:t>
+      </w:r>
+      <w:r>
+        <w:rPr>
+          <w:rFonts w:ascii="Century Schoolbook" w:hAnsi="Century Schoolbook"/>
+        </w:rPr>
+        <w:t xml:space="preserve"> / No </w:t>
       </w:r>
     </w:p>
     <w:p>
@@ -4829,6 +5040,12 @@
         </w:rPr>
         <w:t xml:space="preserve"> </w:t>
       </w:r>
+      <w:r>
+        <w:rPr>
+          <w:rFonts w:ascii="Century Schoolbook" w:hAnsi="Century Schoolbook"/>
+        </w:rPr>
+        <w:t>Explaining more in depth what dimensionality reduction does.</w:t>
+      </w:r>
     </w:p>
     <w:p>
       <w:pPr>
@@ -4865,7 +5082,7 @@
         </w:rPr>
       </w:r>
       <w:r>
-        <w:pict w14:anchorId="38C3F43A">
+        <w:pict w14:anchorId="2895159B">
           <v:rect id="Horizontal Line 11" o:spid="_x0000_s2052" style="width:451.3pt;height:1.1pt;visibility:visible;mso-wrap-style:square;mso-left-percent:-10001;mso-top-percent:-10001;mso-position-horizontal:absolute;mso-position-horizontal-relative:char;mso-position-vertical:absolute;mso-position-vertical-relative:line;mso-left-percent:-10001;mso-top-percent:-10001;v-text-anchor:top" o:gfxdata="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" filled="f">
             <o:lock v:ext="edit" rotation="t" aspectratio="t" verticies="t" text="t" shapetype="t"/>
             <w10:anchorlock/>
@@ -4912,7 +5129,6 @@
           <w:b/>
           <w:bCs/>
         </w:rPr>
-        <w:lastRenderedPageBreak/>
         <w:t>Notebook:</w:t>
       </w:r>
       <w:r>
@@ -5136,6 +5352,8 @@
         <w:jc w:val="both"/>
         <w:rPr>
           <w:rFonts w:ascii="Century Schoolbook" w:hAnsi="Century Schoolbook"/>
+          <w:b/>
+          <w:bCs/>
         </w:rPr>
       </w:pPr>
       <w:r>
@@ -5149,6 +5367,88 @@
     </w:p>
     <w:p>
       <w:pPr>
+        <w:pStyle w:val="ListParagraph"/>
+        <w:numPr>
+          <w:ilvl w:val="0"/>
+          <w:numId w:val="27"/>
+        </w:numPr>
+        <w:jc w:val="both"/>
+        <w:rPr>
+          <w:rFonts w:ascii="Century Schoolbook" w:hAnsi="Century Schoolbook"/>
+        </w:rPr>
+      </w:pPr>
+      <w:r>
+        <w:rPr>
+          <w:rFonts w:ascii="Century Schoolbook" w:hAnsi="Century Schoolbook"/>
+        </w:rPr>
+        <w:t>X</w:t>
+      </w:r>
+    </w:p>
+    <w:p>
+      <w:pPr>
+        <w:pStyle w:val="ListParagraph"/>
+        <w:numPr>
+          <w:ilvl w:val="0"/>
+          <w:numId w:val="27"/>
+        </w:numPr>
+        <w:jc w:val="both"/>
+        <w:rPr>
+          <w:rFonts w:ascii="Century Schoolbook" w:hAnsi="Century Schoolbook"/>
+        </w:rPr>
+      </w:pPr>
+      <w:r>
+        <w:rPr>
+          <w:rFonts w:ascii="Century Schoolbook" w:hAnsi="Century Schoolbook"/>
+        </w:rPr>
+        <w:t>Since PCA is linear</w:t>
+      </w:r>
+      <w:r>
+        <w:rPr>
+          <w:rFonts w:ascii="Century Schoolbook" w:hAnsi="Century Schoolbook"/>
+        </w:rPr>
+        <w:t>, i</w:t>
+      </w:r>
+      <w:r>
+        <w:rPr>
+          <w:rFonts w:ascii="Century Schoolbook" w:hAnsi="Century Schoolbook"/>
+        </w:rPr>
+        <w:t xml:space="preserve">t can only make </w:t>
+      </w:r>
+      <w:r>
+        <w:rPr>
+          <w:rFonts w:ascii="Century Schoolbook" w:hAnsi="Century Schoolbook"/>
+        </w:rPr>
+        <w:t>only make its new columns by</w:t>
+      </w:r>
+      <w:r>
+        <w:rPr>
+          <w:rFonts w:ascii="Century Schoolbook" w:hAnsi="Century Schoolbook"/>
+        </w:rPr>
+        <w:t xml:space="preserve"> adding up the old columns with fixed weights. It picks where the data has the most variance. However, the most spread out direction isn’t always the one that separates topics. In word-count data, the biggest variations is often just “lost posts vs. short posts,” because long posts have higher counts for everything. So PCA’s first axis tends to sort documents by length rather than the topic itself. Another reason why PCA struggles is because the structure is not flat. The way documents group by topic in 35,000 dimensions is not a simple linear line. On the other hand, t-SNE and UMAP are non-linear. They look at each document, and those with similar words, and arrange the 2D dots so that these similar documents stay close to one another</w:t>
+      </w:r>
+    </w:p>
+    <w:p>
+      <w:pPr>
+        <w:pStyle w:val="ListParagraph"/>
+        <w:numPr>
+          <w:ilvl w:val="0"/>
+          <w:numId w:val="27"/>
+        </w:numPr>
+        <w:jc w:val="both"/>
+        <w:rPr>
+          <w:rFonts w:ascii="Century Schoolbook" w:hAnsi="Century Schoolbook"/>
+        </w:rPr>
+      </w:pPr>
+      <w:r>
+        <w:rPr>
+          <w:rFonts w:ascii="Century Schoolbook" w:hAnsi="Century Schoolbook"/>
+        </w:rPr>
+        <w:lastRenderedPageBreak/>
+        <w:t xml:space="preserve">Since t-SNE only tried to preserve which documents are close to which, it doesn’t try to preserve large distances. Inside a cluster, the points being near each other might need further analysis. However, between clusters, the gap size could mean nothing at all. Cluster sizes can also be a bit misleading, because t-SNE tends to spread out dense groups and push sparse ones closer to each other. </w:t>
+      </w:r>
+    </w:p>
+    <w:p>
+      <w:pPr>
         <w:jc w:val="both"/>
         <w:rPr>
           <w:rFonts w:ascii="Century Schoolbook" w:hAnsi="Century Schoolbook"/>
@@ -5266,7 +5566,7 @@
         </w:rPr>
       </w:r>
       <w:r>
-        <w:pict w14:anchorId="22D853F8">
+        <w:pict w14:anchorId="0A61CE83">
           <v:rect id="Horizontal Line 12" o:spid="_x0000_s2051" style="width:451.3pt;height:1.1pt;visibility:visible;mso-wrap-style:square;mso-left-percent:-10001;mso-top-percent:-10001;mso-position-horizontal:absolute;mso-position-horizontal-relative:char;mso-position-vertical:absolute;mso-position-vertical-relative:line;mso-left-percent:-10001;mso-top-percent:-10001;v-text-anchor:top" o:gfxdata="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" filled="f">
             <o:lock v:ext="edit" rotation="t" aspectratio="t" verticies="t" text="t" shapetype="t"/>
             <w10:anchorlock/>
@@ -5557,7 +5857,7 @@
         </w:rPr>
       </w:r>
       <w:r>
-        <w:pict w14:anchorId="2A3C78D6">
+        <w:pict w14:anchorId="0C47C20C">
           <v:rect id="Horizontal Line 13" o:spid="_x0000_s2050" style="width:451.3pt;height:1.1pt;visibility:visible;mso-wrap-style:square;mso-left-percent:-10001;mso-top-percent:-10001;mso-position-horizontal:absolute;mso-position-horizontal-relative:char;mso-position-vertical:absolute;mso-position-vertical-relative:line;mso-left-percent:-10001;mso-top-percent:-10001;v-text-anchor:top" o:gfxdata="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" filled="f">
             <o:lock v:ext="edit" rotation="t" aspectratio="t" verticies="t" text="t" shapetype="t"/>
             <w10:anchorlock/>
@@ -7572,6 +7872,96 @@
     </w:lvl>
   </w:abstractNum>
   <w:abstractNum w:abstractNumId="17" w15:restartNumberingAfterBreak="0">
+    <w:nsid w:val="5BE4072C"/>
+    <w:multiLevelType w:val="hybridMultilevel"/>
+    <w:tmpl w:val="758AB83A"/>
+    <w:lvl w:ilvl="0" w:tplc="54F21E22">
+      <w:start w:val="1"/>
+      <w:numFmt w:val="decimal"/>
+      <w:lvlText w:val="%1."/>
+      <w:lvlJc w:val="left"/>
+      <w:pPr>
+        <w:ind w:left="720" w:hanging="360"/>
+      </w:pPr>
+      <w:rPr>
+        <w:rFonts w:hint="default"/>
+        <w:b/>
+      </w:rPr>
+    </w:lvl>
+    <w:lvl w:ilvl="1" w:tplc="04090019" w:tentative="1">
+      <w:start w:val="1"/>
+      <w:numFmt w:val="lowerLetter"/>
+      <w:lvlText w:val="%2."/>
+      <w:lvlJc w:val="left"/>
+      <w:pPr>
+        <w:ind w:left="1440" w:hanging="360"/>
+      </w:pPr>
+    </w:lvl>
+    <w:lvl w:ilvl="2" w:tplc="0409001B" w:tentative="1">
+      <w:start w:val="1"/>
+      <w:numFmt w:val="lowerRoman"/>
+      <w:lvlText w:val="%3."/>
+      <w:lvlJc w:val="right"/>
+      <w:pPr>
+        <w:ind w:left="2160" w:hanging="180"/>
+      </w:pPr>
+    </w:lvl>
+    <w:lvl w:ilvl="3" w:tplc="0409000F" w:tentative="1">
+      <w:start w:val="1"/>
+      <w:numFmt w:val="decimal"/>
+      <w:lvlText w:val="%4."/>
+      <w:lvlJc w:val="left"/>
+      <w:pPr>
+        <w:ind w:left="2880" w:hanging="360"/>
+      </w:pPr>
+    </w:lvl>
+    <w:lvl w:ilvl="4" w:tplc="04090019" w:tentative="1">
+      <w:start w:val="1"/>
+      <w:numFmt w:val="lowerLetter"/>
+      <w:lvlText w:val="%5."/>
+      <w:lvlJc w:val="left"/>
+      <w:pPr>
+        <w:ind w:left="3600" w:hanging="360"/>
+      </w:pPr>
+    </w:lvl>
+    <w:lvl w:ilvl="5" w:tplc="0409001B" w:tentative="1">
+      <w:start w:val="1"/>
+      <w:numFmt w:val="lowerRoman"/>
+      <w:lvlText w:val="%6."/>
+      <w:lvlJc w:val="right"/>
+      <w:pPr>
+        <w:ind w:left="4320" w:hanging="180"/>
+      </w:pPr>
+    </w:lvl>
+    <w:lvl w:ilvl="6" w:tplc="0409000F" w:tentative="1">
+      <w:start w:val="1"/>
+      <w:numFmt w:val="decimal"/>
+      <w:lvlText w:val="%7."/>
+      <w:lvlJc w:val="left"/>
+      <w:pPr>
+        <w:ind w:left="5040" w:hanging="360"/>
+      </w:pPr>
+    </w:lvl>
+    <w:lvl w:ilvl="7" w:tplc="04090019" w:tentative="1">
+      <w:start w:val="1"/>
+      <w:numFmt w:val="lowerLetter"/>
+      <w:lvlText w:val="%8."/>
+      <w:lvlJc w:val="left"/>
+      <w:pPr>
+        <w:ind w:left="5760" w:hanging="360"/>
+      </w:pPr>
+    </w:lvl>
+    <w:lvl w:ilvl="8" w:tplc="0409001B" w:tentative="1">
+      <w:start w:val="1"/>
+      <w:numFmt w:val="lowerRoman"/>
+      <w:lvlText w:val="%9."/>
+      <w:lvlJc w:val="right"/>
+      <w:pPr>
+        <w:ind w:left="6480" w:hanging="180"/>
+      </w:pPr>
+    </w:lvl>
+  </w:abstractNum>
+  <w:abstractNum w:abstractNumId="18" w15:restartNumberingAfterBreak="0">
     <w:nsid w:val="600745AA"/>
     <w:multiLevelType w:val="hybridMultilevel"/>
     <w:tmpl w:val="7BCE176C"/>
@@ -7711,7 +8101,7 @@
       </w:rPr>
     </w:lvl>
   </w:abstractNum>
-  <w:abstractNum w:abstractNumId="18" w15:restartNumberingAfterBreak="0">
+  <w:abstractNum w:abstractNumId="19" w15:restartNumberingAfterBreak="0">
     <w:nsid w:val="63660093"/>
     <w:multiLevelType w:val="multilevel"/>
     <w:tmpl w:val="487AC5E8"/>
@@ -7824,7 +8214,7 @@
       </w:pPr>
     </w:lvl>
   </w:abstractNum>
-  <w:abstractNum w:abstractNumId="19" w15:restartNumberingAfterBreak="0">
+  <w:abstractNum w:abstractNumId="20" w15:restartNumberingAfterBreak="0">
     <w:nsid w:val="66633041"/>
     <w:multiLevelType w:val="hybridMultilevel"/>
     <w:tmpl w:val="F3BAEAD8"/>
@@ -7964,7 +8354,7 @@
       </w:rPr>
     </w:lvl>
   </w:abstractNum>
-  <w:abstractNum w:abstractNumId="20" w15:restartNumberingAfterBreak="0">
+  <w:abstractNum w:abstractNumId="21" w15:restartNumberingAfterBreak="0">
     <w:nsid w:val="67445AD2"/>
     <w:multiLevelType w:val="hybridMultilevel"/>
     <w:tmpl w:val="C4DE3054"/>
@@ -8104,7 +8494,7 @@
       </w:rPr>
     </w:lvl>
   </w:abstractNum>
-  <w:abstractNum w:abstractNumId="21" w15:restartNumberingAfterBreak="0">
+  <w:abstractNum w:abstractNumId="22" w15:restartNumberingAfterBreak="0">
     <w:nsid w:val="6E5869E4"/>
     <w:multiLevelType w:val="multilevel"/>
     <w:tmpl w:val="22AC937C"/>
@@ -8217,7 +8607,7 @@
       </w:pPr>
     </w:lvl>
   </w:abstractNum>
-  <w:abstractNum w:abstractNumId="22" w15:restartNumberingAfterBreak="0">
+  <w:abstractNum w:abstractNumId="23" w15:restartNumberingAfterBreak="0">
     <w:nsid w:val="6F90345B"/>
     <w:multiLevelType w:val="multilevel"/>
     <w:tmpl w:val="76CCD152"/>
@@ -8330,7 +8720,7 @@
       </w:pPr>
     </w:lvl>
   </w:abstractNum>
-  <w:abstractNum w:abstractNumId="23" w15:restartNumberingAfterBreak="0">
+  <w:abstractNum w:abstractNumId="24" w15:restartNumberingAfterBreak="0">
     <w:nsid w:val="745C3AEA"/>
     <w:multiLevelType w:val="hybridMultilevel"/>
     <w:tmpl w:val="AB2AF8BA"/>
@@ -8443,7 +8833,7 @@
       </w:rPr>
     </w:lvl>
   </w:abstractNum>
-  <w:abstractNum w:abstractNumId="24" w15:restartNumberingAfterBreak="0">
+  <w:abstractNum w:abstractNumId="25" w15:restartNumberingAfterBreak="0">
     <w:nsid w:val="755D4AD5"/>
     <w:multiLevelType w:val="multilevel"/>
     <w:tmpl w:val="1AF6A79A"/>
@@ -8592,7 +8982,7 @@
       </w:rPr>
     </w:lvl>
   </w:abstractNum>
-  <w:abstractNum w:abstractNumId="25" w15:restartNumberingAfterBreak="0">
+  <w:abstractNum w:abstractNumId="26" w15:restartNumberingAfterBreak="0">
     <w:nsid w:val="7D601873"/>
     <w:multiLevelType w:val="multilevel"/>
     <w:tmpl w:val="6660EE9E"/>
@@ -8751,7 +9141,7 @@
     <w:abstractNumId w:val="0"/>
   </w:num>
   <w:num w:numId="4" w16cid:durableId="731463887">
-    <w:abstractNumId w:val="24"/>
+    <w:abstractNumId w:val="25"/>
   </w:num>
   <w:num w:numId="5" w16cid:durableId="619185889">
     <w:abstractNumId w:val="2"/>
@@ -8760,16 +9150,16 @@
     <w:abstractNumId w:val="6"/>
   </w:num>
   <w:num w:numId="7" w16cid:durableId="1588727719">
-    <w:abstractNumId w:val="22"/>
+    <w:abstractNumId w:val="23"/>
   </w:num>
   <w:num w:numId="8" w16cid:durableId="533738981">
     <w:abstractNumId w:val="9"/>
   </w:num>
   <w:num w:numId="9" w16cid:durableId="1269434050">
-    <w:abstractNumId w:val="21"/>
+    <w:abstractNumId w:val="22"/>
   </w:num>
   <w:num w:numId="10" w16cid:durableId="1732079054">
-    <w:abstractNumId w:val="18"/>
+    <w:abstractNumId w:val="19"/>
   </w:num>
   <w:num w:numId="11" w16cid:durableId="1035348155">
     <w:abstractNumId w:val="12"/>
@@ -8778,10 +9168,10 @@
     <w:abstractNumId w:val="13"/>
   </w:num>
   <w:num w:numId="13" w16cid:durableId="1675378421">
-    <w:abstractNumId w:val="25"/>
+    <w:abstractNumId w:val="26"/>
   </w:num>
   <w:num w:numId="14" w16cid:durableId="815490794">
-    <w:abstractNumId w:val="23"/>
+    <w:abstractNumId w:val="24"/>
   </w:num>
   <w:num w:numId="15" w16cid:durableId="1567035629">
     <w:abstractNumId w:val="3"/>
@@ -8790,10 +9180,10 @@
     <w:abstractNumId w:val="15"/>
   </w:num>
   <w:num w:numId="17" w16cid:durableId="467089125">
-    <w:abstractNumId w:val="17"/>
+    <w:abstractNumId w:val="18"/>
   </w:num>
   <w:num w:numId="18" w16cid:durableId="771702364">
-    <w:abstractNumId w:val="20"/>
+    <w:abstractNumId w:val="21"/>
   </w:num>
   <w:num w:numId="19" w16cid:durableId="893585597">
     <w:abstractNumId w:val="10"/>
@@ -8811,13 +9201,16 @@
     <w:abstractNumId w:val="7"/>
   </w:num>
   <w:num w:numId="24" w16cid:durableId="1413353911">
-    <w:abstractNumId w:val="19"/>
+    <w:abstractNumId w:val="20"/>
   </w:num>
   <w:num w:numId="25" w16cid:durableId="2136213698">
     <w:abstractNumId w:val="4"/>
   </w:num>
   <w:num w:numId="26" w16cid:durableId="1587180076">
     <w:abstractNumId w:val="11"/>
+  </w:num>
+  <w:num w:numId="27" w16cid:durableId="1318731290">
+    <w:abstractNumId w:val="17"/>
   </w:num>
 </w:numbering>
 </file>

</xml_diff>

<commit_message>
Finished Master questions 1-10
</commit_message>
<xml_diff>
--- a/DM2026-Lab1-Master-Questions.docx
+++ b/DM2026-Lab1-Master-Questions.docx
@@ -99,7 +99,7 @@
         </w:rPr>
       </w:r>
       <w:r>
-        <w:pict w14:anchorId="49188BD7">
+        <w:pict w14:anchorId="3A8D7421">
           <v:rect id="Horizontal Line 1" o:spid="_x0000_s2062" style="width:451.3pt;height:1.1pt;visibility:visible;mso-wrap-style:square;mso-left-percent:-10001;mso-top-percent:-10001;mso-position-horizontal:absolute;mso-position-horizontal-relative:char;mso-position-vertical:absolute;mso-position-vertical-relative:line;mso-left-percent:-10001;mso-top-percent:-10001;v-text-anchor:top" o:gfxdata="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" filled="f">
             <o:lock v:ext="edit" rotation="t" aspectratio="t" verticies="t" text="t" shapetype="t"/>
             <w10:anchorlock/>
@@ -361,7 +361,7 @@
         </w:rPr>
       </w:r>
       <w:r>
-        <w:pict w14:anchorId="42DDFFA5">
+        <w:pict w14:anchorId="0F2E433D">
           <v:rect id="Horizontal Line 2" o:spid="_x0000_s2061" style="width:451.3pt;height:1.1pt;visibility:visible;mso-wrap-style:square;mso-left-percent:-10001;mso-top-percent:-10001;mso-position-horizontal:absolute;mso-position-horizontal-relative:char;mso-position-vertical:absolute;mso-position-vertical-relative:line;mso-left-percent:-10001;mso-top-percent:-10001;v-text-anchor:top" o:gfxdata="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" filled="f">
             <o:lock v:ext="edit" rotation="t" aspectratio="t" verticies="t" text="t" shapetype="t"/>
             <w10:anchorlock/>
@@ -1330,7 +1330,7 @@
         </w:rPr>
       </w:r>
       <w:r>
-        <w:pict w14:anchorId="5FECD586">
+        <w:pict w14:anchorId="2457D2FF">
           <v:rect id="Horizontal Line 3" o:spid="_x0000_s2060" style="width:451.3pt;height:1.1pt;visibility:visible;mso-wrap-style:square;mso-left-percent:-10001;mso-top-percent:-10001;mso-position-horizontal:absolute;mso-position-horizontal-relative:char;mso-position-vertical:absolute;mso-position-vertical-relative:line;mso-left-percent:-10001;mso-top-percent:-10001;v-text-anchor:top" o:gfxdata="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" filled="f">
             <o:lock v:ext="edit" rotation="t" aspectratio="t" verticies="t" text="t" shapetype="t"/>
             <w10:anchorlock/>
@@ -1666,7 +1666,7 @@
         </w:rPr>
       </w:r>
       <w:r>
-        <w:pict w14:anchorId="6F32A785">
+        <w:pict w14:anchorId="7830ADC1">
           <v:rect id="Horizontal Line 4" o:spid="_x0000_s2059" style="width:451.3pt;height:1.1pt;visibility:visible;mso-wrap-style:square;mso-left-percent:-10001;mso-top-percent:-10001;mso-position-horizontal:absolute;mso-position-horizontal-relative:char;mso-position-vertical:absolute;mso-position-vertical-relative:line;mso-left-percent:-10001;mso-top-percent:-10001;v-text-anchor:top" o:gfxdata="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" filled="f">
             <o:lock v:ext="edit" rotation="t" aspectratio="t" verticies="t" text="t" shapetype="t"/>
             <w10:anchorlock/>
@@ -2049,7 +2049,7 @@
         </w:rPr>
       </w:r>
       <w:r>
-        <w:pict w14:anchorId="69006115">
+        <w:pict w14:anchorId="36BFEF40">
           <v:rect id="Horizontal Line 5" o:spid="_x0000_s2058" style="width:451.3pt;height:1.1pt;visibility:visible;mso-wrap-style:square;mso-left-percent:-10001;mso-top-percent:-10001;mso-position-horizontal:absolute;mso-position-horizontal-relative:char;mso-position-vertical:absolute;mso-position-vertical-relative:line;mso-left-percent:-10001;mso-top-percent:-10001;v-text-anchor:top" o:gfxdata="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" filled="f">
             <o:lock v:ext="edit" rotation="t" aspectratio="t" verticies="t" text="t" shapetype="t"/>
             <w10:anchorlock/>
@@ -2441,7 +2441,7 @@
         </w:rPr>
       </w:r>
       <w:r>
-        <w:pict w14:anchorId="6C9783F2">
+        <w:pict w14:anchorId="7AC28B5C">
           <v:rect id="Horizontal Line 6" o:spid="_x0000_s2057" style="width:451.3pt;height:1.1pt;visibility:visible;mso-wrap-style:square;mso-left-percent:-10001;mso-top-percent:-10001;mso-position-horizontal:absolute;mso-position-horizontal-relative:char;mso-position-vertical:absolute;mso-position-vertical-relative:line;mso-left-percent:-10001;mso-top-percent:-10001;v-text-anchor:top" o:gfxdata="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" filled="f">
             <o:lock v:ext="edit" rotation="t" aspectratio="t" verticies="t" text="t" shapetype="t"/>
             <w10:anchorlock/>
@@ -2927,7 +2927,7 @@
         </w:rPr>
       </w:r>
       <w:r>
-        <w:pict w14:anchorId="5C31F8B2">
+        <w:pict w14:anchorId="130C1097">
           <v:rect id="Horizontal Line 7" o:spid="_x0000_s2056" style="width:451.3pt;height:1.1pt;visibility:visible;mso-wrap-style:square;mso-left-percent:-10001;mso-top-percent:-10001;mso-position-horizontal:absolute;mso-position-horizontal-relative:char;mso-position-vertical:absolute;mso-position-vertical-relative:line;mso-left-percent:-10001;mso-top-percent:-10001;v-text-anchor:top" o:gfxdata="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" filled="f">
             <o:lock v:ext="edit" rotation="t" aspectratio="t" verticies="t" text="t" shapetype="t"/>
             <w10:anchorlock/>
@@ -3704,7 +3704,7 @@
         </w:rPr>
       </w:r>
       <w:r>
-        <w:pict w14:anchorId="3C833291">
+        <w:pict w14:anchorId="4C94A89A">
           <v:rect id="Horizontal Line 8" o:spid="_x0000_s2055" style="width:451.3pt;height:1.1pt;visibility:visible;mso-wrap-style:square;mso-left-percent:-10001;mso-top-percent:-10001;mso-position-horizontal:absolute;mso-position-horizontal-relative:char;mso-position-vertical:absolute;mso-position-vertical-relative:line;mso-left-percent:-10001;mso-top-percent:-10001;v-text-anchor:top" o:gfxdata="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" filled="f">
             <o:lock v:ext="edit" rotation="t" aspectratio="t" verticies="t" text="t" shapetype="t"/>
             <w10:anchorlock/>
@@ -4203,7 +4203,7 @@
         </w:rPr>
       </w:r>
       <w:r>
-        <w:pict w14:anchorId="795BCB8E">
+        <w:pict w14:anchorId="242EC7F7">
           <v:rect id="Horizontal Line 9" o:spid="_x0000_s2054" style="width:451.3pt;height:1.1pt;visibility:visible;mso-wrap-style:square;mso-left-percent:-10001;mso-top-percent:-10001;mso-position-horizontal:absolute;mso-position-horizontal-relative:char;mso-position-vertical:absolute;mso-position-vertical-relative:line;mso-left-percent:-10001;mso-top-percent:-10001;v-text-anchor:top" o:gfxdata="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" filled="f">
             <o:lock v:ext="edit" rotation="t" aspectratio="t" verticies="t" text="t" shapetype="t"/>
             <w10:anchorlock/>
@@ -4773,7 +4773,7 @@
         </w:rPr>
       </w:r>
       <w:r>
-        <w:pict w14:anchorId="72FFD1B6">
+        <w:pict w14:anchorId="718909CE">
           <v:rect id="Horizontal Line 10" o:spid="_x0000_s2053" style="width:451.3pt;height:1.1pt;visibility:visible;mso-wrap-style:square;mso-left-percent:-10001;mso-top-percent:-10001;mso-position-horizontal:absolute;mso-position-horizontal-relative:char;mso-position-vertical:absolute;mso-position-vertical-relative:line;mso-left-percent:-10001;mso-top-percent:-10001;v-text-anchor:top" o:gfxdata="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" filled="f">
             <o:lock v:ext="edit" rotation="t" aspectratio="t" verticies="t" text="t" shapetype="t"/>
             <w10:anchorlock/>
@@ -5082,7 +5082,7 @@
         </w:rPr>
       </w:r>
       <w:r>
-        <w:pict w14:anchorId="2895159B">
+        <w:pict w14:anchorId="3F111C6D">
           <v:rect id="Horizontal Line 11" o:spid="_x0000_s2052" style="width:451.3pt;height:1.1pt;visibility:visible;mso-wrap-style:square;mso-left-percent:-10001;mso-top-percent:-10001;mso-position-horizontal:absolute;mso-position-horizontal-relative:char;mso-position-vertical:absolute;mso-position-vertical-relative:line;mso-left-percent:-10001;mso-top-percent:-10001;v-text-anchor:top" o:gfxdata="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" filled="f">
             <o:lock v:ext="edit" rotation="t" aspectratio="t" verticies="t" text="t" shapetype="t"/>
             <w10:anchorlock/>
@@ -5381,7 +5381,13 @@
         <w:rPr>
           <w:rFonts w:ascii="Century Schoolbook" w:hAnsi="Century Schoolbook"/>
         </w:rPr>
-        <w:t>X</w:t>
+        <w:t>t-SNE/UMAP showed distinct, separated cluster islands</w:t>
+      </w:r>
+      <w:r>
+        <w:rPr>
+          <w:rFonts w:ascii="Century Schoolbook" w:hAnsi="Century Schoolbook"/>
+        </w:rPr>
+        <w:t xml:space="preserve"> while PCA showed heavy overlap around the center.</w:t>
       </w:r>
     </w:p>
     <w:p>
@@ -5424,7 +5430,26 @@
         <w:rPr>
           <w:rFonts w:ascii="Century Schoolbook" w:hAnsi="Century Schoolbook"/>
         </w:rPr>
-        <w:t xml:space="preserve"> adding up the old columns with fixed weights. It picks where the data has the most variance. However, the most spread out direction isn’t always the one that separates topics. In word-count data, the biggest variations is often just “lost posts vs. short posts,” because long posts have higher counts for everything. So PCA’s first axis tends to sort documents by length rather than the topic itself. Another reason why PCA struggles is because the structure is not flat. The way documents group by topic in 35,000 dimensions is not a simple linear line. On the other hand, t-SNE and UMAP are non-linear. They look at each document, and those with similar words, and arrange the 2D dots so that these similar documents stay close to one another</w:t>
+        <w:t xml:space="preserve"> adding up the old columns with fixed weights. It picks where the data has the most variance. However, the most </w:t>
+      </w:r>
+      <w:r>
+        <w:rPr>
+          <w:rFonts w:ascii="Century Schoolbook" w:hAnsi="Century Schoolbook"/>
+        </w:rPr>
+        <w:t>spread-out</w:t>
+      </w:r>
+      <w:r>
+        <w:rPr>
+          <w:rFonts w:ascii="Century Schoolbook" w:hAnsi="Century Schoolbook"/>
+        </w:rPr>
+        <w:t xml:space="preserve"> direction isn’t always the one that separates topics. In word-count data, the biggest variations is often just “lost posts vs. short posts,” because long posts have higher counts for everything. So PCA’s first axis tends to sort documents by length rather than the topic itself. Another reason why PCA struggles is because the structure is not flat. The way documents group by topic in 35,000 dimensions is not a simple linear line. On the other hand, t-SNE and UMAP </w:t>
+      </w:r>
+      <w:r>
+        <w:rPr>
+          <w:rFonts w:ascii="Century Schoolbook" w:hAnsi="Century Schoolbook"/>
+        </w:rPr>
+        <w:lastRenderedPageBreak/>
+        <w:t>are non-linear. They look at each document, and those with similar words, and arrange the 2D dots so that these similar documents stay close to one another</w:t>
       </w:r>
     </w:p>
     <w:p>
@@ -5443,8 +5468,37 @@
         <w:rPr>
           <w:rFonts w:ascii="Century Schoolbook" w:hAnsi="Century Schoolbook"/>
         </w:rPr>
-        <w:lastRenderedPageBreak/>
-        <w:t xml:space="preserve">Since t-SNE only tried to preserve which documents are close to which, it doesn’t try to preserve large distances. Inside a cluster, the points being near each other might need further analysis. However, between clusters, the gap size could mean nothing at all. Cluster sizes can also be a bit misleading, because t-SNE tends to spread out dense groups and push sparse ones closer to each other. </w:t>
+        <w:t xml:space="preserve">Since t-SNE only tried to preserve which documents are close to </w:t>
+      </w:r>
+      <w:r>
+        <w:rPr>
+          <w:rFonts w:ascii="Century Schoolbook" w:hAnsi="Century Schoolbook"/>
+        </w:rPr>
+        <w:t>each other</w:t>
+      </w:r>
+      <w:r>
+        <w:rPr>
+          <w:rFonts w:ascii="Century Schoolbook" w:hAnsi="Century Schoolbook"/>
+        </w:rPr>
+        <w:t xml:space="preserve">, it doesn’t try to preserve large distances. Inside a cluster, </w:t>
+      </w:r>
+      <w:r>
+        <w:rPr>
+          <w:rFonts w:ascii="Century Schoolbook" w:hAnsi="Century Schoolbook"/>
+        </w:rPr>
+        <w:t>closeness within clusters is meaningful</w:t>
+      </w:r>
+      <w:r>
+        <w:rPr>
+          <w:rFonts w:ascii="Century Schoolbook" w:hAnsi="Century Schoolbook"/>
+        </w:rPr>
+        <w:t xml:space="preserve">. However, between clusters, the gap size could mean nothing at all. Cluster sizes can also be a bit misleading, because t-SNE tends to spread out dense groups and push sparse ones closer to each other. </w:t>
+      </w:r>
+      <w:r>
+        <w:rPr>
+          <w:rFonts w:ascii="Century Schoolbook" w:hAnsi="Century Schoolbook"/>
+        </w:rPr>
+        <w:t>UMAP showed the clearest separation, though some categories were still overlapped.</w:t>
       </w:r>
     </w:p>
     <w:p>
@@ -5466,7 +5520,20 @@
         <w:rPr>
           <w:rFonts w:ascii="Century Schoolbook" w:hAnsi="Century Schoolbook"/>
         </w:rPr>
-        <w:t xml:space="preserve"> Yes / No </w:t>
+        <w:t xml:space="preserve"> </w:t>
+      </w:r>
+      <w:r>
+        <w:rPr>
+          <w:rFonts w:ascii="Century Schoolbook" w:hAnsi="Century Schoolbook"/>
+          <w:highlight w:val="yellow"/>
+        </w:rPr>
+        <w:t>Yes</w:t>
+      </w:r>
+      <w:r>
+        <w:rPr>
+          <w:rFonts w:ascii="Century Schoolbook" w:hAnsi="Century Schoolbook"/>
+        </w:rPr>
+        <w:t xml:space="preserve"> / No </w:t>
       </w:r>
     </w:p>
     <w:p>
@@ -5490,12 +5557,20 @@
         </w:rPr>
         <w:t xml:space="preserve"> </w:t>
       </w:r>
-    </w:p>
-    <w:p>
-      <w:pPr>
-        <w:jc w:val="both"/>
-        <w:rPr>
-          <w:rFonts w:ascii="Century Schoolbook" w:hAnsi="Century Schoolbook"/>
+      <w:r>
+        <w:rPr>
+          <w:rFonts w:ascii="Century Schoolbook" w:hAnsi="Century Schoolbook"/>
+        </w:rPr>
+        <w:t xml:space="preserve">Concept explanation </w:t>
+      </w:r>
+    </w:p>
+    <w:p>
+      <w:pPr>
+        <w:jc w:val="both"/>
+        <w:rPr>
+          <w:rFonts w:ascii="Century Schoolbook" w:hAnsi="Century Schoolbook"/>
+          <w:b/>
+          <w:bCs/>
         </w:rPr>
       </w:pPr>
       <w:r>
@@ -5509,6 +5584,8 @@
       <w:r>
         <w:rPr>
           <w:rFonts w:ascii="Century Schoolbook" w:hAnsi="Century Schoolbook"/>
+          <w:b/>
+          <w:bCs/>
         </w:rPr>
         <w:t xml:space="preserve"> </w:t>
       </w:r>
@@ -5520,6 +5597,70 @@
           <w:rFonts w:ascii="Century Schoolbook" w:hAnsi="Century Schoolbook"/>
         </w:rPr>
       </w:pPr>
+      <w:r>
+        <w:rPr>
+          <w:rFonts w:ascii="Century Schoolbook" w:hAnsi="Century Schoolbook"/>
+        </w:rPr>
+        <w:t>Part 2:</w:t>
+      </w:r>
+      <w:r>
+        <w:rPr>
+          <w:rFonts w:ascii="Century Schoolbook" w:hAnsi="Century Schoolbook"/>
+        </w:rPr>
+        <w:t xml:space="preserve"> </w:t>
+      </w:r>
+      <w:hyperlink r:id="rId9" w:history="1">
+        <w:r>
+          <w:rPr>
+            <w:rStyle w:val="Hyperlink"/>
+            <w:rFonts w:ascii="Century Schoolbook" w:hAnsi="Century Schoolbook"/>
+          </w:rPr>
+          <w:t>https://scikit-learn.org/stable/modules/manifold.html</w:t>
+        </w:r>
+      </w:hyperlink>
+      <w:r>
+        <w:rPr>
+          <w:rFonts w:ascii="Century Schoolbook" w:hAnsi="Century Schoolbook"/>
+        </w:rPr>
+        <w:t xml:space="preserve"> </w:t>
+      </w:r>
+    </w:p>
+    <w:p>
+      <w:pPr>
+        <w:jc w:val="both"/>
+        <w:rPr>
+          <w:rFonts w:ascii="Times New Roman" w:hAnsi="Times New Roman" w:cs="Times New Roman"/>
+        </w:rPr>
+      </w:pPr>
+      <w:r>
+        <w:rPr>
+          <w:rFonts w:ascii="Century Schoolbook" w:hAnsi="Century Schoolbook" w:cs="Times New Roman"/>
+        </w:rPr>
+        <w:t xml:space="preserve">Part 3: </w:t>
+      </w:r>
+      <w:hyperlink r:id="rId10" w:history="1">
+        <w:r>
+          <w:rPr>
+            <w:rStyle w:val="Hyperlink"/>
+            <w:rFonts w:ascii="Century Schoolbook" w:hAnsi="Century Schoolbook" w:cs="Times New Roman"/>
+          </w:rPr>
+          <w:t>https://distill.pub/2016/misread-tsne/</w:t>
+        </w:r>
+      </w:hyperlink>
+      <w:r>
+        <w:rPr>
+          <w:rFonts w:ascii="Times New Roman" w:hAnsi="Times New Roman" w:cs="Times New Roman"/>
+        </w:rPr>
+        <w:t xml:space="preserve"> </w:t>
+      </w:r>
+    </w:p>
+    <w:p>
+      <w:pPr>
+        <w:jc w:val="both"/>
+        <w:rPr>
+          <w:rFonts w:ascii="Century Schoolbook" w:hAnsi="Century Schoolbook"/>
+        </w:rPr>
+      </w:pPr>
     </w:p>
     <w:p>
       <w:pPr>
@@ -5566,7 +5707,7 @@
         </w:rPr>
       </w:r>
       <w:r>
-        <w:pict w14:anchorId="0A61CE83">
+        <w:pict w14:anchorId="322D968A">
           <v:rect id="Horizontal Line 12" o:spid="_x0000_s2051" style="width:451.3pt;height:1.1pt;visibility:visible;mso-wrap-style:square;mso-left-percent:-10001;mso-top-percent:-10001;mso-position-horizontal:absolute;mso-position-horizontal-relative:char;mso-position-vertical:absolute;mso-position-vertical-relative:line;mso-left-percent:-10001;mso-top-percent:-10001;v-text-anchor:top" o:gfxdata="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" filled="f">
             <o:lock v:ext="edit" rotation="t" aspectratio="t" verticies="t" text="t" shapetype="t"/>
             <w10:anchorlock/>
@@ -5767,6 +5908,8 @@
         <w:jc w:val="both"/>
         <w:rPr>
           <w:rFonts w:ascii="Century Schoolbook" w:hAnsi="Century Schoolbook"/>
+          <w:b/>
+          <w:bCs/>
         </w:rPr>
       </w:pPr>
       <w:r>
@@ -5780,6 +5923,76 @@
     </w:p>
     <w:p>
       <w:pPr>
+        <w:pStyle w:val="ListParagraph"/>
+        <w:numPr>
+          <w:ilvl w:val="0"/>
+          <w:numId w:val="28"/>
+        </w:numPr>
+        <w:jc w:val="both"/>
+        <w:rPr>
+          <w:rFonts w:ascii="Century Schoolbook" w:hAnsi="Century Schoolbook"/>
+        </w:rPr>
+      </w:pPr>
+      <w:r>
+        <w:rPr>
+          <w:rFonts w:ascii="Century Schoolbook" w:hAnsi="Century Schoolbook"/>
+        </w:rPr>
+        <w:t>4 binary columns are created to represent the 4 categories.</w:t>
+      </w:r>
+    </w:p>
+    <w:p>
+      <w:pPr>
+        <w:pStyle w:val="ListParagraph"/>
+        <w:numPr>
+          <w:ilvl w:val="0"/>
+          <w:numId w:val="28"/>
+        </w:numPr>
+        <w:jc w:val="both"/>
+        <w:rPr>
+          <w:rFonts w:ascii="Century Schoolbook" w:hAnsi="Century Schoolbook"/>
+        </w:rPr>
+      </w:pPr>
+      <w:r>
+        <w:rPr>
+          <w:rFonts w:ascii="Century Schoolbook" w:hAnsi="Century Schoolbook"/>
+        </w:rPr>
+        <w:t xml:space="preserve">If an algorithm is given a raw integer column (0, 1, 2, 3) as an input, it would assume that the category 3 is larger than category 1. </w:t>
+      </w:r>
+    </w:p>
+    <w:p>
+      <w:pPr>
+        <w:pStyle w:val="ListParagraph"/>
+        <w:numPr>
+          <w:ilvl w:val="0"/>
+          <w:numId w:val="28"/>
+        </w:numPr>
+        <w:jc w:val="both"/>
+        <w:rPr>
+          <w:rFonts w:ascii="Century Schoolbook" w:hAnsi="Century Schoolbook"/>
+        </w:rPr>
+      </w:pPr>
+      <w:r>
+        <w:rPr>
+          <w:rFonts w:ascii="Century Schoolbook" w:hAnsi="Century Schoolbook"/>
+        </w:rPr>
+        <w:t xml:space="preserve">One hot binarization eliminates this false assumption by giving each category its own column, and a document has a 1 (binary) only in its own category’s column. </w:t>
+      </w:r>
+      <w:r>
+        <w:rPr>
+          <w:rFonts w:ascii="Century Schoolbook" w:hAnsi="Century Schoolbook"/>
+        </w:rPr>
+        <w:lastRenderedPageBreak/>
+        <w:t xml:space="preserve">This removes the </w:t>
+      </w:r>
+      <w:r>
+        <w:rPr>
+          <w:rFonts w:ascii="Century Schoolbook" w:hAnsi="Century Schoolbook"/>
+        </w:rPr>
+        <w:t>order and makes it so no category is “larger” than the other. Each one just answers a binary, whether or not the document is in a category.</w:t>
+      </w:r>
+    </w:p>
+    <w:p>
+      <w:pPr>
         <w:jc w:val="both"/>
         <w:rPr>
           <w:rFonts w:ascii="Century Schoolbook" w:hAnsi="Century Schoolbook"/>
@@ -5851,13 +6064,36 @@
           <w:rFonts w:ascii="Century Schoolbook" w:hAnsi="Century Schoolbook"/>
         </w:rPr>
       </w:pPr>
+      <w:hyperlink r:id="rId11" w:history="1">
+        <w:r>
+          <w:rPr>
+            <w:rStyle w:val="Hyperlink"/>
+            <w:rFonts w:ascii="Century Schoolbook" w:hAnsi="Century Schoolbook"/>
+          </w:rPr>
+          <w:t>https://scikit-learn.org/stable/modules/generated/sklearn.preprocessing.LabelBinarizer.html</w:t>
+        </w:r>
+      </w:hyperlink>
+      <w:r>
+        <w:rPr>
+          <w:rFonts w:ascii="Century Schoolbook" w:hAnsi="Century Schoolbook"/>
+        </w:rPr>
+        <w:t xml:space="preserve"> </w:t>
+      </w:r>
+    </w:p>
+    <w:p>
+      <w:pPr>
+        <w:jc w:val="both"/>
+        <w:rPr>
+          <w:rFonts w:ascii="Century Schoolbook" w:hAnsi="Century Schoolbook"/>
+        </w:rPr>
+      </w:pPr>
       <w:r>
         <w:rPr>
           <w:noProof/>
         </w:rPr>
       </w:r>
       <w:r>
-        <w:pict w14:anchorId="0C47C20C">
+        <w:pict w14:anchorId="36BC6529">
           <v:rect id="Horizontal Line 13" o:spid="_x0000_s2050" style="width:451.3pt;height:1.1pt;visibility:visible;mso-wrap-style:square;mso-left-percent:-10001;mso-top-percent:-10001;mso-position-horizontal:absolute;mso-position-horizontal-relative:char;mso-position-vertical:absolute;mso-position-vertical-relative:line;mso-left-percent:-10001;mso-top-percent:-10001;v-text-anchor:top" o:gfxdata="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" filled="f">
             <o:lock v:ext="edit" rotation="t" aspectratio="t" verticies="t" text="t" shapetype="t"/>
             <w10:anchorlock/>
@@ -7217,6 +7453,96 @@
     </w:lvl>
   </w:abstractNum>
   <w:abstractNum w:abstractNumId="11" w15:restartNumberingAfterBreak="0">
+    <w:nsid w:val="4B7D2E71"/>
+    <w:multiLevelType w:val="hybridMultilevel"/>
+    <w:tmpl w:val="A454C2BE"/>
+    <w:lvl w:ilvl="0" w:tplc="C19E84C2">
+      <w:start w:val="1"/>
+      <w:numFmt w:val="decimal"/>
+      <w:lvlText w:val="%1."/>
+      <w:lvlJc w:val="left"/>
+      <w:pPr>
+        <w:ind w:left="720" w:hanging="360"/>
+      </w:pPr>
+      <w:rPr>
+        <w:rFonts w:hint="default"/>
+        <w:b/>
+      </w:rPr>
+    </w:lvl>
+    <w:lvl w:ilvl="1" w:tplc="04090019" w:tentative="1">
+      <w:start w:val="1"/>
+      <w:numFmt w:val="lowerLetter"/>
+      <w:lvlText w:val="%2."/>
+      <w:lvlJc w:val="left"/>
+      <w:pPr>
+        <w:ind w:left="1440" w:hanging="360"/>
+      </w:pPr>
+    </w:lvl>
+    <w:lvl w:ilvl="2" w:tplc="0409001B" w:tentative="1">
+      <w:start w:val="1"/>
+      <w:numFmt w:val="lowerRoman"/>
+      <w:lvlText w:val="%3."/>
+      <w:lvlJc w:val="right"/>
+      <w:pPr>
+        <w:ind w:left="2160" w:hanging="180"/>
+      </w:pPr>
+    </w:lvl>
+    <w:lvl w:ilvl="3" w:tplc="0409000F" w:tentative="1">
+      <w:start w:val="1"/>
+      <w:numFmt w:val="decimal"/>
+      <w:lvlText w:val="%4."/>
+      <w:lvlJc w:val="left"/>
+      <w:pPr>
+        <w:ind w:left="2880" w:hanging="360"/>
+      </w:pPr>
+    </w:lvl>
+    <w:lvl w:ilvl="4" w:tplc="04090019" w:tentative="1">
+      <w:start w:val="1"/>
+      <w:numFmt w:val="lowerLetter"/>
+      <w:lvlText w:val="%5."/>
+      <w:lvlJc w:val="left"/>
+      <w:pPr>
+        <w:ind w:left="3600" w:hanging="360"/>
+      </w:pPr>
+    </w:lvl>
+    <w:lvl w:ilvl="5" w:tplc="0409001B" w:tentative="1">
+      <w:start w:val="1"/>
+      <w:numFmt w:val="lowerRoman"/>
+      <w:lvlText w:val="%6."/>
+      <w:lvlJc w:val="right"/>
+      <w:pPr>
+        <w:ind w:left="4320" w:hanging="180"/>
+      </w:pPr>
+    </w:lvl>
+    <w:lvl w:ilvl="6" w:tplc="0409000F" w:tentative="1">
+      <w:start w:val="1"/>
+      <w:numFmt w:val="decimal"/>
+      <w:lvlText w:val="%7."/>
+      <w:lvlJc w:val="left"/>
+      <w:pPr>
+        <w:ind w:left="5040" w:hanging="360"/>
+      </w:pPr>
+    </w:lvl>
+    <w:lvl w:ilvl="7" w:tplc="04090019" w:tentative="1">
+      <w:start w:val="1"/>
+      <w:numFmt w:val="lowerLetter"/>
+      <w:lvlText w:val="%8."/>
+      <w:lvlJc w:val="left"/>
+      <w:pPr>
+        <w:ind w:left="5760" w:hanging="360"/>
+      </w:pPr>
+    </w:lvl>
+    <w:lvl w:ilvl="8" w:tplc="0409001B" w:tentative="1">
+      <w:start w:val="1"/>
+      <w:numFmt w:val="lowerRoman"/>
+      <w:lvlText w:val="%9."/>
+      <w:lvlJc w:val="right"/>
+      <w:pPr>
+        <w:ind w:left="6480" w:hanging="180"/>
+      </w:pPr>
+    </w:lvl>
+  </w:abstractNum>
+  <w:abstractNum w:abstractNumId="12" w15:restartNumberingAfterBreak="0">
     <w:nsid w:val="4D840E67"/>
     <w:multiLevelType w:val="hybridMultilevel"/>
     <w:tmpl w:val="3D2041B8"/>
@@ -7306,7 +7632,7 @@
       </w:pPr>
     </w:lvl>
   </w:abstractNum>
-  <w:abstractNum w:abstractNumId="12" w15:restartNumberingAfterBreak="0">
+  <w:abstractNum w:abstractNumId="13" w15:restartNumberingAfterBreak="0">
     <w:nsid w:val="4DD357A6"/>
     <w:multiLevelType w:val="multilevel"/>
     <w:tmpl w:val="707E0AF4"/>
@@ -7419,7 +7745,7 @@
       </w:pPr>
     </w:lvl>
   </w:abstractNum>
-  <w:abstractNum w:abstractNumId="13" w15:restartNumberingAfterBreak="0">
+  <w:abstractNum w:abstractNumId="14" w15:restartNumberingAfterBreak="0">
     <w:nsid w:val="4FA53F13"/>
     <w:multiLevelType w:val="multilevel"/>
     <w:tmpl w:val="143EEEE0"/>
@@ -7532,7 +7858,7 @@
       </w:pPr>
     </w:lvl>
   </w:abstractNum>
-  <w:abstractNum w:abstractNumId="14" w15:restartNumberingAfterBreak="0">
+  <w:abstractNum w:abstractNumId="15" w15:restartNumberingAfterBreak="0">
     <w:nsid w:val="50686C5F"/>
     <w:multiLevelType w:val="multilevel"/>
     <w:tmpl w:val="9F2C0B54"/>
@@ -7645,7 +7971,7 @@
       </w:pPr>
     </w:lvl>
   </w:abstractNum>
-  <w:abstractNum w:abstractNumId="15" w15:restartNumberingAfterBreak="0">
+  <w:abstractNum w:abstractNumId="16" w15:restartNumberingAfterBreak="0">
     <w:nsid w:val="510B6AF3"/>
     <w:multiLevelType w:val="hybridMultilevel"/>
     <w:tmpl w:val="6B0E57B6"/>
@@ -7785,7 +8111,7 @@
       </w:rPr>
     </w:lvl>
   </w:abstractNum>
-  <w:abstractNum w:abstractNumId="16" w15:restartNumberingAfterBreak="0">
+  <w:abstractNum w:abstractNumId="17" w15:restartNumberingAfterBreak="0">
     <w:nsid w:val="576A4380"/>
     <w:multiLevelType w:val="hybridMultilevel"/>
     <w:tmpl w:val="7F86CB26"/>
@@ -7871,7 +8197,7 @@
       </w:pPr>
     </w:lvl>
   </w:abstractNum>
-  <w:abstractNum w:abstractNumId="17" w15:restartNumberingAfterBreak="0">
+  <w:abstractNum w:abstractNumId="18" w15:restartNumberingAfterBreak="0">
     <w:nsid w:val="5BE4072C"/>
     <w:multiLevelType w:val="hybridMultilevel"/>
     <w:tmpl w:val="758AB83A"/>
@@ -7961,7 +8287,7 @@
       </w:pPr>
     </w:lvl>
   </w:abstractNum>
-  <w:abstractNum w:abstractNumId="18" w15:restartNumberingAfterBreak="0">
+  <w:abstractNum w:abstractNumId="19" w15:restartNumberingAfterBreak="0">
     <w:nsid w:val="600745AA"/>
     <w:multiLevelType w:val="hybridMultilevel"/>
     <w:tmpl w:val="7BCE176C"/>
@@ -8101,7 +8427,7 @@
       </w:rPr>
     </w:lvl>
   </w:abstractNum>
-  <w:abstractNum w:abstractNumId="19" w15:restartNumberingAfterBreak="0">
+  <w:abstractNum w:abstractNumId="20" w15:restartNumberingAfterBreak="0">
     <w:nsid w:val="63660093"/>
     <w:multiLevelType w:val="multilevel"/>
     <w:tmpl w:val="487AC5E8"/>
@@ -8214,7 +8540,7 @@
       </w:pPr>
     </w:lvl>
   </w:abstractNum>
-  <w:abstractNum w:abstractNumId="20" w15:restartNumberingAfterBreak="0">
+  <w:abstractNum w:abstractNumId="21" w15:restartNumberingAfterBreak="0">
     <w:nsid w:val="66633041"/>
     <w:multiLevelType w:val="hybridMultilevel"/>
     <w:tmpl w:val="F3BAEAD8"/>
@@ -8354,7 +8680,7 @@
       </w:rPr>
     </w:lvl>
   </w:abstractNum>
-  <w:abstractNum w:abstractNumId="21" w15:restartNumberingAfterBreak="0">
+  <w:abstractNum w:abstractNumId="22" w15:restartNumberingAfterBreak="0">
     <w:nsid w:val="67445AD2"/>
     <w:multiLevelType w:val="hybridMultilevel"/>
     <w:tmpl w:val="C4DE3054"/>
@@ -8494,7 +8820,7 @@
       </w:rPr>
     </w:lvl>
   </w:abstractNum>
-  <w:abstractNum w:abstractNumId="22" w15:restartNumberingAfterBreak="0">
+  <w:abstractNum w:abstractNumId="23" w15:restartNumberingAfterBreak="0">
     <w:nsid w:val="6E5869E4"/>
     <w:multiLevelType w:val="multilevel"/>
     <w:tmpl w:val="22AC937C"/>
@@ -8607,7 +8933,7 @@
       </w:pPr>
     </w:lvl>
   </w:abstractNum>
-  <w:abstractNum w:abstractNumId="23" w15:restartNumberingAfterBreak="0">
+  <w:abstractNum w:abstractNumId="24" w15:restartNumberingAfterBreak="0">
     <w:nsid w:val="6F90345B"/>
     <w:multiLevelType w:val="multilevel"/>
     <w:tmpl w:val="76CCD152"/>
@@ -8720,7 +9046,7 @@
       </w:pPr>
     </w:lvl>
   </w:abstractNum>
-  <w:abstractNum w:abstractNumId="24" w15:restartNumberingAfterBreak="0">
+  <w:abstractNum w:abstractNumId="25" w15:restartNumberingAfterBreak="0">
     <w:nsid w:val="745C3AEA"/>
     <w:multiLevelType w:val="hybridMultilevel"/>
     <w:tmpl w:val="AB2AF8BA"/>
@@ -8833,7 +9159,7 @@
       </w:rPr>
     </w:lvl>
   </w:abstractNum>
-  <w:abstractNum w:abstractNumId="25" w15:restartNumberingAfterBreak="0">
+  <w:abstractNum w:abstractNumId="26" w15:restartNumberingAfterBreak="0">
     <w:nsid w:val="755D4AD5"/>
     <w:multiLevelType w:val="multilevel"/>
     <w:tmpl w:val="1AF6A79A"/>
@@ -8982,7 +9308,7 @@
       </w:rPr>
     </w:lvl>
   </w:abstractNum>
-  <w:abstractNum w:abstractNumId="26" w15:restartNumberingAfterBreak="0">
+  <w:abstractNum w:abstractNumId="27" w15:restartNumberingAfterBreak="0">
     <w:nsid w:val="7D601873"/>
     <w:multiLevelType w:val="multilevel"/>
     <w:tmpl w:val="6660EE9E"/>
@@ -9135,13 +9461,13 @@
     <w:abstractNumId w:val="8"/>
   </w:num>
   <w:num w:numId="2" w16cid:durableId="184292703">
-    <w:abstractNumId w:val="14"/>
+    <w:abstractNumId w:val="15"/>
   </w:num>
   <w:num w:numId="3" w16cid:durableId="1575118697">
     <w:abstractNumId w:val="0"/>
   </w:num>
   <w:num w:numId="4" w16cid:durableId="731463887">
-    <w:abstractNumId w:val="25"/>
+    <w:abstractNumId w:val="26"/>
   </w:num>
   <w:num w:numId="5" w16cid:durableId="619185889">
     <w:abstractNumId w:val="2"/>
@@ -9150,46 +9476,46 @@
     <w:abstractNumId w:val="6"/>
   </w:num>
   <w:num w:numId="7" w16cid:durableId="1588727719">
-    <w:abstractNumId w:val="23"/>
+    <w:abstractNumId w:val="24"/>
   </w:num>
   <w:num w:numId="8" w16cid:durableId="533738981">
     <w:abstractNumId w:val="9"/>
   </w:num>
   <w:num w:numId="9" w16cid:durableId="1269434050">
-    <w:abstractNumId w:val="22"/>
+    <w:abstractNumId w:val="23"/>
   </w:num>
   <w:num w:numId="10" w16cid:durableId="1732079054">
-    <w:abstractNumId w:val="19"/>
+    <w:abstractNumId w:val="20"/>
   </w:num>
   <w:num w:numId="11" w16cid:durableId="1035348155">
-    <w:abstractNumId w:val="12"/>
+    <w:abstractNumId w:val="13"/>
   </w:num>
   <w:num w:numId="12" w16cid:durableId="1142964469">
-    <w:abstractNumId w:val="13"/>
+    <w:abstractNumId w:val="14"/>
   </w:num>
   <w:num w:numId="13" w16cid:durableId="1675378421">
-    <w:abstractNumId w:val="26"/>
+    <w:abstractNumId w:val="27"/>
   </w:num>
   <w:num w:numId="14" w16cid:durableId="815490794">
-    <w:abstractNumId w:val="24"/>
+    <w:abstractNumId w:val="25"/>
   </w:num>
   <w:num w:numId="15" w16cid:durableId="1567035629">
     <w:abstractNumId w:val="3"/>
   </w:num>
   <w:num w:numId="16" w16cid:durableId="1944191802">
-    <w:abstractNumId w:val="15"/>
+    <w:abstractNumId w:val="16"/>
   </w:num>
   <w:num w:numId="17" w16cid:durableId="467089125">
-    <w:abstractNumId w:val="18"/>
+    <w:abstractNumId w:val="19"/>
   </w:num>
   <w:num w:numId="18" w16cid:durableId="771702364">
-    <w:abstractNumId w:val="21"/>
+    <w:abstractNumId w:val="22"/>
   </w:num>
   <w:num w:numId="19" w16cid:durableId="893585597">
     <w:abstractNumId w:val="10"/>
   </w:num>
   <w:num w:numId="20" w16cid:durableId="5520643">
-    <w:abstractNumId w:val="16"/>
+    <w:abstractNumId w:val="17"/>
   </w:num>
   <w:num w:numId="21" w16cid:durableId="1673995430">
     <w:abstractNumId w:val="5"/>
@@ -9201,16 +9527,19 @@
     <w:abstractNumId w:val="7"/>
   </w:num>
   <w:num w:numId="24" w16cid:durableId="1413353911">
-    <w:abstractNumId w:val="20"/>
+    <w:abstractNumId w:val="21"/>
   </w:num>
   <w:num w:numId="25" w16cid:durableId="2136213698">
     <w:abstractNumId w:val="4"/>
   </w:num>
   <w:num w:numId="26" w16cid:durableId="1587180076">
-    <w:abstractNumId w:val="11"/>
+    <w:abstractNumId w:val="12"/>
   </w:num>
   <w:num w:numId="27" w16cid:durableId="1318731290">
-    <w:abstractNumId w:val="17"/>
+    <w:abstractNumId w:val="18"/>
+  </w:num>
+  <w:num w:numId="28" w16cid:durableId="1828979657">
+    <w:abstractNumId w:val="11"/>
   </w:num>
 </w:numbering>
 </file>
@@ -10218,6 +10547,18 @@
       <w:shd w:val="clear" w:color="auto" w:fill="E1DFDD"/>
     </w:rPr>
   </w:style>
+  <w:style w:type="character" w:styleId="FollowedHyperlink">
+    <w:name w:val="FollowedHyperlink"/>
+    <w:basedOn w:val="DefaultParagraphFont"/>
+    <w:uiPriority w:val="99"/>
+    <w:semiHidden/>
+    <w:unhideWhenUsed/>
+    <w:rsid w:val="00293712"/>
+    <w:rPr>
+      <w:color w:val="96607D" w:themeColor="followedHyperlink"/>
+      <w:u w:val="single"/>
+    </w:rPr>
+  </w:style>
 </w:styles>
 </file>
 

</xml_diff>